<commit_message>
Final polish: email, grammar, abbreviations, keywords
</commit_message>
<xml_diff>
--- a/biorxiv_english.docx
+++ b/biorxiv_english.docx
@@ -95,7 +95,7 @@
           <w:sz w:val="20"/>
           <w:szCs w:val="20"/>
         </w:rPr>
-        <w:t xml:space="preserve">*Correspondence: [your-email]</w:t>
+        <w:t xml:space="preserve">*Correspondence: 2742391737@qq.com</w:t>
       </w:r>
     </w:p>
     <w:p>
@@ -170,7 +170,7 @@
           <w:sz w:val="22"/>
           <w:szCs w:val="22"/>
         </w:rPr>
-        <w:t xml:space="preserve">We built the core UniPert-G2CP architecture, which integrates ECFP4 compound fingerprints, ESM2-8M protein anchoring, contrastive learning with CPI alignment, and two-stage transfer, and scaled it to 32,039 compounds × 162 cell lines (4× and 32× the original, respectively) with genome-wide output (12,328 genes).</w:t>
+        <w:t xml:space="preserve">We built the core UniPert-G2CP architecture, which integrates Extended-Connectivity Fingerprints 4 (ECFP4) compound fingerprints, ESM2-8M protein language model anchoring, contrastive learning with CPI alignment, and two-stage transfer, and scaled it to 32,039 compounds × 162 cell lines (4× and 32× the original, respectively) with genome-wide output (12,328 genes).</w:t>
       </w:r>
     </w:p>
     <w:p>
@@ -260,7 +260,7 @@
           <w:sz w:val="22"/>
           <w:szCs w:val="22"/>
         </w:rPr>
-        <w:t xml:space="preserve">perturbation prediction; transcriptomics; contrastive learning; drug response; CRISPR screening; virtual cell</w:t>
+        <w:t xml:space="preserve">perturbation prediction, transcriptomics, contrastive learning, drug response, CRISPR screening, virtual cell</w:t>
       </w:r>
     </w:p>
     <w:p>
@@ -2383,7 +2383,7 @@
           <w:sz w:val="22"/>
           <w:szCs w:val="22"/>
         </w:rPr>
-        <w:t xml:space="preserve">We have independently built and scaled the UniPert-G2CP architecture to 162 cell lines, 32,039 compounds, and genome-wide output, producing a deployed virtual-cell prediction platform. The architecture scales successfully, but performance is sensitive to CPI training vocabulary, revealing a domain-transfer bottleneck rather than a simple architectural limitation. Held-out perturbation metrics, benchmark-consistent evaluation, and biological validation examples are provided as transparent reference points. The platform is freely available as a candidate-screening tool for perturbation biology research.</w:t>
+        <w:t xml:space="preserve">We have independently built and scaled the UniPert-G2CP architecture to 162 cell lines, 32,039 compounds, and genome-wide output, producing a virtual-cell prediction platform accessible via interactive API upon reasonable request. The architecture scales successfully, but performance is sensitive to CPI training vocabulary, revealing a domain-transfer bottleneck rather than a simple architectural limitation. Held-out perturbation metrics, benchmark-consistent evaluation, and biological validation examples are provided as transparent reference points. The platform is freely available as a candidate-screening tool for perturbation biology research.</w:t>
       </w:r>
     </w:p>
     <w:p>
@@ -2437,7 +2437,7 @@
           <w:sz w:val="22"/>
           <w:szCs w:val="22"/>
         </w:rPr>
-        <w:t xml:space="preserve">Competing interests: The author declares no competing interests.</w:t>
+        <w:t xml:space="preserve">Competing interests: The authors declare no competing interests.</w:t>
       </w:r>
     </w:p>
     <w:p>

</xml_diff>

<commit_message>
Fix: CPA brackets, NT-Xent full name, Stage A AdamW
</commit_message>
<xml_diff>
--- a/biorxiv_english.docx
+++ b/biorxiv_english.docx
@@ -388,7 +388,7 @@
           <w:sz w:val="22"/>
           <w:szCs w:val="22"/>
         </w:rPr>
-        <w:t xml:space="preserve">The architecture follows UniPert-G2CP: drug encoder (ECFP4, 2048-bit → 512-dim Linear); gene encoder (4,994×512 embedding, first 320 dims ESM2-8M-anchored [4]); unified space (NT-Xent with temperature τ = 0.07 + CPI alignment via cosine distance, loss weights 1.0 : 0.8); phenotype head takes the concatenated perturbation embedding (512-dim) and cell embedding (32-dim) as a 544-dim input, processed through two fully connected layers (Linear 544→1024, GELU, Linear 1024→12,328) to produce genome-wide output; two-stage transfer (DepMap → LINCS). The gene encoder dimension (4,994) defines the perturbation vocabulary (genes that can be knocked out); the phenotype head output (12,328) defines the response vocabulary (genes whose expression is predicted). The head is a generic MLP that does not require equality between these two gene sets, following standard perturbation-model architecture (GEARS, Compositional Perturbation Autoencoder [CPA]).</w:t>
+        <w:t xml:space="preserve">The architecture follows UniPert-G2CP: drug encoder (ECFP4, 2048-bit → 512-dim Linear); gene encoder (4,994×512 embedding, first 320 dims ESM2-8M-anchored [4]); unified space (Normalized Temperature-scaled Cross-Entropy loss, NT-Xent, with temperature τ = 0.07 + CPI alignment via cosine distance, loss weights 1.0 : 0.8); phenotype head takes the concatenated perturbation embedding (512-dim) and cell embedding (32-dim) as a 544-dim input, processed through two fully connected layers (Linear 544→1024, GELU, Linear 1024→12,328) to produce genome-wide output; two-stage transfer (DepMap → LINCS). The gene encoder dimension (4,994) defines the perturbation vocabulary (genes that can be knocked out); the phenotype head output (12,328) defines the response vocabulary (genes whose expression is predicted). The head is a generic MLP that does not require equality between these two gene sets, following standard perturbation-model architecture (GEARS, Compositional Perturbation Autoencoder (CPA)).</w:t>
       </w:r>
     </w:p>
     <w:p>
@@ -415,7 +415,7 @@
           <w:sz w:val="22"/>
           <w:szCs w:val="22"/>
         </w:rPr>
-        <w:t xml:space="preserve">Stage A (DepMap pretraining): 10 epochs, lr=3×10⁻⁴, only phenotype head trained. Stage B (LINCS finetuning): AdamW (lr=3×10⁻⁴), batch size 256, 40 epochs, gene encoder frozen throughout, drug encoder and phenotype head trained.</w:t>
+        <w:t xml:space="preserve">Stage A (DepMap pretraining): 10 epochs, AdamW (lr=3×10⁻⁴), only phenotype head trained. Stage B (LINCS finetuning): AdamW (lr=3×10⁻⁴), batch size 256, 40 epochs, gene encoder frozen throughout, drug encoder and phenotype head trained.</w:t>
       </w:r>
     </w:p>
     <w:p>

</xml_diff>